<commit_message>
Extract PDFs and filter active index by expert terms
</commit_message>
<xml_diff>
--- a/docs/final-technical-report.docx
+++ b/docs/final-technical-report.docx
@@ -40,7 +40,7 @@
         <w:spacing w:after="80"/>
       </w:pPr>
       <w:r>
-        <w:t>This project implements a document retrieval system for a controlled document base about mental health and wellbeing among university students. The executable flow builds a 10-document corpus, applies linguistic preprocessing, resolves synonyms and polysemy/domain phrases, constructs the FrecT term-document matrix, applies SVD/LSI, executes similarity and dissimilarity queries, and attempts to persist the corpus, selected terms, LSI evidence, query runs, and ranked results in PostgreSQL.</w:t>
+        <w:t>This project implements a document retrieval system for a PDF document base about mental health and wellbeing among university students. The executable flow extracts text from the PDFs, applies linguistic preprocessing, resolves synonyms and polysemy/domain phrases, constructs the FrecT term-document matrix, applies SVD/LSI, lets expert-selected terms define the active filtered index, executes similarity and dissimilarity queries, and attempts to persist the corpus, selected terms, LSI evidence, query runs, and ranked results in PostgreSQL.</w:t>
       </w:r>
     </w:p>
     <w:p>
@@ -48,7 +48,7 @@
         <w:spacing w:after="80"/>
       </w:pPr>
       <w:r>
-        <w:t>The raw PDFs under `data/raw/` are reference source material. The final executable demo intentionally uses `data/fixtures/query/document_terms.csv` as a controlled corpus so every evaluator sees the same FrecT, SVD/LSI, and query output.</w:t>
+        <w:t>The PDFs under `data/raw/` are the source document base used by `main`. CSV fixtures remain only for legacy/unit-test support.</w:t>
       </w:r>
     </w:p>
     <w:p>
@@ -160,7 +160,7 @@
         <w:pStyle w:val="ListBullet"/>
       </w:pPr>
       <w:r>
-        <w:t>Corpus: `data/fixtures/query/document_terms.csv` with D1-D10.</w:t>
+        <w:t>Corpus: PDF files extracted from `data/raw/`.</w:t>
       </w:r>
     </w:p>
     <w:p>
@@ -280,7 +280,7 @@
         <w:spacing w:after="80"/>
       </w:pPr>
       <w:r>
-        <w:t>The relational demo data is loaded with:</w:t>
+        <w:t>The relational schema is created with:</w:t>
       </w:r>
     </w:p>
     <w:p>
@@ -294,19 +294,6 @@
           <w:sz w:val="16"/>
         </w:rPr>
         <w:t>mvn flyway:migrate "-Dflyway.password=your_password_here"</w:t>
-      </w:r>
-    </w:p>
-    <w:p>
-      <w:pPr>
-        <w:spacing w:after="20"/>
-        <w:ind w:left="259"/>
-      </w:pPr>
-      <w:r>
-        <w:rPr>
-          <w:rFonts w:ascii="Consolas" w:hAnsi="Consolas"/>
-          <w:sz w:val="16"/>
-        </w:rPr>
-        <w:t>psql -U postgres -h localhost -p 5433 -d lsi_documentbase -f sql/demo/insert_demo_data.sql</w:t>
       </w:r>
     </w:p>
     <w:p>
@@ -362,7 +349,7 @@
         <w:spacing w:after="80"/>
       </w:pPr>
       <w:r>
-        <w:t>3. `IndexingService` loads the controlled 10-document corpus.</w:t>
+        <w:t>3. `IndexingService` extracts text from the PDFs in `data/raw/`.</w:t>
       </w:r>
     </w:p>
     <w:p>
@@ -370,7 +357,7 @@
         <w:spacing w:after="80"/>
       </w:pPr>
       <w:r>
-        <w:t>4. `PreprocessingPipeline` normalizes, tokenizes, filters stop words, and stems terms.</w:t>
+        <w:t>4. `PreprocessingPipeline` normalizes, tokenizes, filters stop words, removes numeric/table noise, and stems terms.</w:t>
       </w:r>
     </w:p>
     <w:p>
@@ -410,7 +397,7 @@
         <w:spacing w:after="80"/>
       </w:pPr>
       <w:r>
-        <w:t>9. `CorpusPersistenceService` attempts to save documents, terms, FrecT rows, LSI vectors, and selected terms.</w:t>
+        <w:t>9. The system rebuilds FrecT/LSI using only the expert-selected indexing terms.</w:t>
       </w:r>
     </w:p>
     <w:p>
@@ -418,7 +405,7 @@
         <w:spacing w:after="80"/>
       </w:pPr>
       <w:r>
-        <w:t>10. `QueryProcessor` executes document comparison and top-n retrieval.</w:t>
+        <w:t>10. `CorpusPersistenceService` attempts to save documents, terms, FrecT rows, LSI vectors, and selected terms.</w:t>
       </w:r>
     </w:p>
     <w:p>
@@ -426,7 +413,7 @@
         <w:spacing w:after="80"/>
       </w:pPr>
       <w:r>
-        <w:t>11. `QueryResultPersistenceService` attempts to save query runs and ranked results.</w:t>
+        <w:t>11. `QueryProcessor` executes document comparison and top-n retrieval on the active filtered index.</w:t>
       </w:r>
     </w:p>
     <w:p>
@@ -434,7 +421,15 @@
         <w:spacing w:after="80"/>
       </w:pPr>
       <w:r>
-        <w:t>12. The CLI prints technical evidence for review.</w:t>
+        <w:t>12. `QueryResultPersistenceService` attempts to save query runs and ranked results.</w:t>
+      </w:r>
+    </w:p>
+    <w:p>
+      <w:pPr>
+        <w:spacing w:after="80"/>
+      </w:pPr>
+      <w:r>
+        <w:t>13. The CLI prints technical evidence for review.</w:t>
       </w:r>
     </w:p>
     <w:p>
@@ -490,7 +485,7 @@
         <w:pStyle w:val="ListBullet"/>
       </w:pPr>
       <w:r>
-        <w:t>D1-D10 are loaded from the controlled corpus.</w:t>
+        <w:t>PDF documents are extracted from `data/raw/`.</w:t>
       </w:r>
     </w:p>
     <w:p>
@@ -522,7 +517,7 @@
         <w:pStyle w:val="ListBullet"/>
       </w:pPr>
       <w:r>
-        <w:t>Expert-selected terms are printed and persisted when PostgreSQL is available.</w:t>
+        <w:t>Expert-selected terms are printed, used to rebuild the active index, and persisted when PostgreSQL is available.</w:t>
       </w:r>
     </w:p>
     <w:p>
@@ -661,57 +656,6 @@
     </w:p>
     <w:p>
       <w:pPr>
-        <w:jc w:val="center"/>
-      </w:pPr>
-      <w:r>
-        <w:drawing>
-          <wp:inline xmlns:a="http://schemas.openxmlformats.org/drawingml/2006/main" xmlns:pic="http://schemas.openxmlformats.org/drawingml/2006/picture">
-            <wp:extent cx="5257800" cy="3154680"/>
-            <wp:docPr id="3" name="Picture 3"/>
-            <wp:cNvGraphicFramePr>
-              <a:graphicFrameLocks noChangeAspect="1"/>
-            </wp:cNvGraphicFramePr>
-            <a:graphic>
-              <a:graphicData uri="http://schemas.openxmlformats.org/drawingml/2006/picture">
-                <pic:pic>
-                  <pic:nvPicPr>
-                    <pic:cNvPr id="0" name="sql-demo-d1-d10.png"/>
-                    <pic:cNvPicPr/>
-                  </pic:nvPicPr>
-                  <pic:blipFill>
-                    <a:blip r:embed="rId11"/>
-                    <a:stretch>
-                      <a:fillRect/>
-                    </a:stretch>
-                  </pic:blipFill>
-                  <pic:spPr>
-                    <a:xfrm>
-                      <a:off x="0" y="0"/>
-                      <a:ext cx="5257800" cy="3154680"/>
-                    </a:xfrm>
-                    <a:prstGeom prst="rect"/>
-                  </pic:spPr>
-                </pic:pic>
-              </a:graphicData>
-            </a:graphic>
-          </wp:inline>
-        </w:drawing>
-      </w:r>
-    </w:p>
-    <w:p>
-      <w:pPr>
-        <w:jc w:val="center"/>
-      </w:pPr>
-      <w:r>
-        <w:rPr>
-          <w:i/>
-          <w:sz w:val="17"/>
-        </w:rPr>
-        <w:t>SQL D1-D10 evidence</w:t>
-      </w:r>
-    </w:p>
-    <w:p>
-      <w:pPr>
         <w:pStyle w:val="Heading2"/>
       </w:pPr>
       <w:r>
@@ -763,7 +707,7 @@
         <w:spacing w:after="80"/>
       </w:pPr>
       <w:r>
-        <w:t>`sql/demo/insert_demo_data.sql` now aligns with the Java corpus by loading D1-D10, not only D1-D3.</w:t>
+        <w:t>When PostgreSQL is available, the Java runtime persists the extracted PDF corpus and the active expert-filtered index through `CorpusPersistenceService`, so the relational evidence comes from the same PDF-based execution path used by `main`.</w:t>
       </w:r>
     </w:p>
     <w:p>
@@ -876,7 +820,7 @@
         <w:spacing w:after="80"/>
       </w:pPr>
       <w:r>
-        <w:t>The system now satisfies the requested delivery points: controlled 10-document base, FrecT, stop list, suffix list, stems, synonyms, polysemy, SVD/LSI, expert indexing-term selection, SQL query files, two similarity functions, one dissimilarity function, DBMS-backed persistence path, console evidence, and a report structured around the project requirements.</w:t>
+        <w:t>The system now satisfies the requested delivery points: real PDF document base, FrecT, stop list, suffix list, stems, synonyms, polysemy, SVD/LSI, expert indexing-term selection that controls the active index, SQL query files, two similarity functions, one dissimilarity function, DBMS-backed persistence path, console evidence, and a report structured around the project requirements.</w:t>
       </w:r>
     </w:p>
     <w:p>

</xml_diff>

<commit_message>
Se añadio uana guÃia de ejecucion para el proyecto junto con cambios a la documentacion actual
</commit_message>
<xml_diff>
--- a/docs/final-technical-report.docx
+++ b/docs/final-technical-report.docx
@@ -40,7 +40,7 @@
         <w:spacing w:after="80"/>
       </w:pPr>
       <w:r>
-        <w:t>This project implements a document retrieval system for a PDF document base about mental health and wellbeing among university students. The executable flow extracts text from the PDFs, applies linguistic preprocessing, resolves synonyms and polysemy/domain phrases, constructs the FrecT term-document matrix, applies SVD/LSI, lets expert-selected terms define the active filtered index, executes similarity and dissimilarity queries, and attempts to persist the corpus, selected terms, LSI evidence, query runs, and ranked results in PostgreSQL.</w:t>
+        <w:t>This project implements a document retrieval system for a PDF document base about mental health and wellbeing among university students. The executable flow imports real PDFs into PostgreSQL, loads the document base from the `documents` table, applies linguistic preprocessing, resolves synonyms and polysemy/domain phrases, constructs the FrecT term-document matrix, applies SVD/LSI, lets expert-selected terms define the active filtered index, executes similarity and dissimilarity queries, and persists the corpus, selected terms, LSI evidence, query runs, and ranked results in PostgreSQL when the database-backed execution path is used.</w:t>
       </w:r>
     </w:p>
     <w:p>
@@ -48,7 +48,7 @@
         <w:spacing w:after="80"/>
       </w:pPr>
       <w:r>
-        <w:t>The PDFs under `data/raw/` are the source document base used by `main`. CSV fixtures remain only for legacy/unit-test support.</w:t>
+        <w:t>The PDFs under `data/raw/` are the real source document base. CSV fixtures remain only for legacy/unit-test support. The recommended final execution path is: `data/raw/*.pdf -&gt; import-pdfs-db -&gt; PostgreSQL -&gt; final-demo --source db --persist true -&gt; query --source db --persist true`.</w:t>
       </w:r>
     </w:p>
     <w:p>
@@ -305,6 +305,18 @@
       </w:r>
     </w:p>
     <w:p>
+      <w:pPr/>
+      <w:r>
+        <w:t>For the final integrated flow, the database is not only a secondary output. It is also used as the source of the runtime corpus after importing PDFs with: mvn exec:java "-Dexec.mainClass=com.lsi.App" "-Dexec.args=import-pdfs-db --reset true".</w:t>
+      </w:r>
+    </w:p>
+    <w:p>
+      <w:pPr/>
+      <w:r>
+        <w:t>The legacy script `sql/demo/insert_demo_data.sql` remains available for SQL-only manual experiments, but it is not the recommended final execution path.</w:t>
+      </w:r>
+    </w:p>
+    <w:p>
       <w:pPr>
         <w:pStyle w:val="Heading2"/>
       </w:pPr>
@@ -325,7 +337,7 @@
         <w:spacing w:after="80"/>
       </w:pPr>
       <w:r>
-        <w:t>Runtime flow from `main`:</w:t>
+        <w:t>Runtime flow for the database-backed execution:</w:t>
       </w:r>
     </w:p>
     <w:p>
@@ -341,7 +353,7 @@
         <w:spacing w:after="80"/>
       </w:pPr>
       <w:r>
-        <w:t>2. No arguments starts `final-demo`.</w:t>
+        <w:t>2. `import-pdfs-db --reset true` imports real PDFs from `data/raw/` into PostgreSQL.</w:t>
       </w:r>
     </w:p>
     <w:p>
@@ -349,7 +361,7 @@
         <w:spacing w:after="80"/>
       </w:pPr>
       <w:r>
-        <w:t>3. `IndexingService` extracts text from the PDFs in `data/raw/`.</w:t>
+        <w:t>3. `final-demo --source db --persist true` loads documents from the PostgreSQL `documents` table.</w:t>
       </w:r>
     </w:p>
     <w:p>
@@ -405,7 +417,7 @@
         <w:spacing w:after="80"/>
       </w:pPr>
       <w:r>
-        <w:t>10. `CorpusPersistenceService` attempts to save documents, terms, FrecT rows, LSI vectors, and selected terms.</w:t>
+        <w:t>10. `CorpusPersistenceService` saves documents, terms, FrecT rows, LSI vectors, and selected terms.</w:t>
       </w:r>
     </w:p>
     <w:p>
@@ -421,7 +433,7 @@
         <w:spacing w:after="80"/>
       </w:pPr>
       <w:r>
-        <w:t>12. `QueryResultPersistenceService` attempts to save query runs and ranked results.</w:t>
+        <w:t>12. `query --source db --persist true` saves query runs and ranked results in `query_runs` and `query_results`.</w:t>
       </w:r>
     </w:p>
     <w:p>
@@ -433,6 +445,12 @@
       </w:r>
     </w:p>
     <w:p>
+      <w:pPr/>
+      <w:r>
+        <w:t>The project can still execute a guided demo without explicit database flags, but the recommended reproducible path for the final integrated version is the database-backed path described above.</w:t>
+      </w:r>
+    </w:p>
+    <w:p>
       <w:pPr>
         <w:pStyle w:val="Heading2"/>
       </w:pPr>
@@ -465,6 +483,12 @@
       </w:r>
     </w:p>
     <w:p>
+      <w:pPr/>
+      <w:r>
+        <w:t>The final integration step connected the runtime pipeline to PostgreSQL in both directions: real PDFs are imported into `documents`, the LSI pipeline can use PostgreSQL as the document source, and the generated artifacts are persisted back into relational tables for SQL verification.</w:t>
+      </w:r>
+    </w:p>
+    <w:p>
       <w:pPr>
         <w:pStyle w:val="Heading2"/>
       </w:pPr>
@@ -477,7 +501,7 @@
         <w:spacing w:after="80"/>
       </w:pPr>
       <w:r>
-        <w:t>The current `main` execution prints the complete guided demonstration:</w:t>
+        <w:t>The current database-backed execution prints the complete guided demonstration:</w:t>
       </w:r>
     </w:p>
     <w:p>
@@ -485,7 +509,15 @@
         <w:pStyle w:val="ListBullet"/>
       </w:pPr>
       <w:r>
-        <w:t>PDF documents are extracted from `data/raw/`.</w:t>
+        <w:t>PDF documents are imported from `data/raw/` into PostgreSQL.</w:t>
+      </w:r>
+    </w:p>
+    <w:p>
+      <w:pPr>
+        <w:pStyle w:val="ListBullet"/>
+      </w:pPr>
+      <w:r>
+        <w:t>The final demo loads the document base from PostgreSQL using `--source db`.</w:t>
       </w:r>
     </w:p>
     <w:p>
@@ -550,6 +582,20 @@
       </w:pPr>
       <w:r>
         <w:t>`academic stress` is retrieved with Euclidean distance, where lower score means closer.</w:t>
+      </w:r>
+    </w:p>
+    <w:p>
+      <w:pPr>
+        <w:pStyle w:val="ListBullet"/>
+      </w:pPr>
+      <w:r>
+        <w:t>Query executions and ranked results are persisted when `query --source db --persist true` is used.</w:t>
+      </w:r>
+    </w:p>
+    <w:p>
+      <w:pPr/>
+      <w:r>
+        <w:t>The validated runtime evidence included execution over a real imported PDF corpus. In one successful run, the system built an LSI matrix with thousands of terms over the imported PDF documents and persisted ranked query results for cosine, Jaccard, and Euclidean executions.</w:t>
       </w:r>
     </w:p>
     <w:p>
@@ -703,11 +749,65 @@
       </w:r>
     </w:p>
     <w:p>
+      <w:pPr/>
+      <w:r>
+        <w:t>Additional SQL verification files confirm that the database-backed execution persisted the generated artifacts:</w:t>
+      </w:r>
+    </w:p>
+    <w:p>
+      <w:pPr>
+        <w:pStyle w:val="ListBullet"/>
+      </w:pPr>
+      <w:r>
+        <w:t>`sql/queries/02_list_documents.sql`: verifies documents imported from `data/raw/.`</w:t>
+      </w:r>
+    </w:p>
+    <w:p>
+      <w:pPr>
+        <w:pStyle w:val="ListBullet"/>
+      </w:pPr>
+      <w:r>
+        <w:t>`sql/queries/03_list_terms.sql`: verifies vocabulary terms generated by the pipeline.</w:t>
+      </w:r>
+    </w:p>
+    <w:p>
+      <w:pPr>
+        <w:pStyle w:val="ListBullet"/>
+      </w:pPr>
+      <w:r>
+        <w:t>`sql/queries/04_document_frequency_matrix.sql`: verifies FrecT rows in relational form.</w:t>
+      </w:r>
+    </w:p>
+    <w:p>
+      <w:pPr>
+        <w:pStyle w:val="ListBullet"/>
+      </w:pPr>
+      <w:r>
+        <w:t>`sql/queries/05_lsi_models.sql`: verifies persisted LSI model metadata.</w:t>
+      </w:r>
+    </w:p>
+    <w:p>
+      <w:pPr>
+        <w:pStyle w:val="ListBullet"/>
+      </w:pPr>
+      <w:r>
+        <w:t>`sql/queries/06_lsi_document_vectors.sql`: verifies latent document vectors.</w:t>
+      </w:r>
+    </w:p>
+    <w:p>
+      <w:pPr>
+        <w:pStyle w:val="ListBullet"/>
+      </w:pPr>
+      <w:r>
+        <w:t>`sql/queries/08_query_runs_and_results.sql`: verifies persisted query executions and ranked results.</w:t>
+      </w:r>
+    </w:p>
+    <w:p>
       <w:pPr>
         <w:spacing w:after="80"/>
       </w:pPr>
       <w:r>
-        <w:t>When PostgreSQL is available, the Java runtime persists the extracted PDF corpus and the active expert-filtered index through `CorpusPersistenceService`, so the relational evidence comes from the same PDF-based execution path used by `main`.</w:t>
+        <w:t>When PostgreSQL is available, the Java runtime persists the extracted PDF corpus and the active expert-filtered index through `CorpusPersistenceService`, so the relational evidence comes from the same PDF-based execution path used by the final demo.</w:t>
       </w:r>
     </w:p>
     <w:p>
@@ -732,10 +832,6 @@
         <w:ind w:left="259"/>
       </w:pPr>
       <w:r>
-        <w:rPr>
-          <w:rFonts w:ascii="Consolas" w:hAnsi="Consolas"/>
-          <w:sz w:val="16"/>
-        </w:rPr>
         <w:t>mvn test</w:t>
       </w:r>
     </w:p>
@@ -745,11 +841,7 @@
         <w:ind w:left="259"/>
       </w:pPr>
       <w:r>
-        <w:rPr>
-          <w:rFonts w:ascii="Consolas" w:hAnsi="Consolas"/>
-          <w:sz w:val="16"/>
-        </w:rPr>
-        <w:t>Tests run: 55, Failures: 0, Errors: 0, Skipped: 31</w:t>
+        <w:t>Tests run: 55, Failures: 0, Errors: 0</w:t>
       </w:r>
     </w:p>
     <w:p>
@@ -758,10 +850,6 @@
         <w:ind w:left="259"/>
       </w:pPr>
       <w:r>
-        <w:rPr>
-          <w:rFonts w:ascii="Consolas" w:hAnsi="Consolas"/>
-          <w:sz w:val="16"/>
-        </w:rPr>
         <w:t>BUILD SUCCESS</w:t>
       </w:r>
     </w:p>
@@ -770,7 +858,7 @@
         <w:spacing w:after="80"/>
       </w:pPr>
       <w:r>
-        <w:t>The skipped tests are PostgreSQL integration tests guarded by JUnit assumptions when the local DBMS is unavailable. Main execution verification:</w:t>
+        <w:t>Some PostgreSQL-related tests may be skipped or may depend on local DBMS availability depending on the environment. Since tests can clean and insert temporary data, the final demo state should be rebuilt after running tests.</w:t>
       </w:r>
     </w:p>
     <w:p>
@@ -779,11 +867,7 @@
         <w:ind w:left="259"/>
       </w:pPr>
       <w:r>
-        <w:rPr>
-          <w:rFonts w:ascii="Consolas" w:hAnsi="Consolas"/>
-          <w:sz w:val="16"/>
-        </w:rPr>
-        <w:t>mvn exec:java "-Dexec.mainClass=com.lsi.App"</w:t>
+        <w:t>Recommended execution verification:</w:t>
       </w:r>
     </w:p>
     <w:p>
@@ -792,11 +876,7 @@
         <w:ind w:left="259"/>
       </w:pPr>
       <w:r>
-        <w:rPr>
-          <w:rFonts w:ascii="Consolas" w:hAnsi="Consolas"/>
-          <w:sz w:val="16"/>
-        </w:rPr>
-        <w:t>BUILD SUCCESS</w:t>
+        <w:t>mvn flyway:migrate "-Dflyway.password=your_password_here"</w:t>
       </w:r>
     </w:p>
     <w:p>
@@ -804,7 +884,55 @@
         <w:spacing w:after="80"/>
       </w:pPr>
       <w:r>
-        <w:t>The successful run confirms that the project starts from `main`, loads the corpus, builds FrecT, applies SVD/LSI, performs the required queries, and attempts database persistence.</w:t>
+        <w:t>mvn exec:java "-Dexec.mainClass=com.lsi.App" "-Dexec.args=import-pdfs-db --reset true"</w:t>
+      </w:r>
+    </w:p>
+    <w:p>
+      <w:pPr/>
+      <w:r>
+        <w:t>mvn exec:java "-Dexec.mainClass=com.lsi.App" "-Dexec.args=final-demo --source db --persist true"</w:t>
+      </w:r>
+    </w:p>
+    <w:p>
+      <w:pPr/>
+      <w:r>
+        <w:t>Recommended query persistence verification from Git Bash:</w:t>
+      </w:r>
+    </w:p>
+    <w:p>
+      <w:pPr/>
+      <w:r>
+        <w:t>mvn exec:java -Dexec.mainClass=com.lsi.App -Dexec.args="query --source db --text \"academic stress anxiety\" --top 5 --metric cosine --persist true"</w:t>
+      </w:r>
+    </w:p>
+    <w:p>
+      <w:pPr/>
+      <w:r>
+        <w:t>mvn exec:java -Dexec.mainClass=com.lsi.App -Dexec.args="query --source db --text \"sleep wellbeing\" --top 5 --metric jaccard --persist true"</w:t>
+      </w:r>
+    </w:p>
+    <w:p>
+      <w:pPr/>
+      <w:r>
+        <w:t>mvn exec:java -Dexec.mainClass=com.lsi.App -Dexec.args="query --source db --text \"academic stress\" --top 5 --metric euclidean --persist true"</w:t>
+      </w:r>
+    </w:p>
+    <w:p>
+      <w:pPr/>
+      <w:r>
+        <w:t>SQL verification:</w:t>
+      </w:r>
+    </w:p>
+    <w:p>
+      <w:pPr/>
+      <w:r>
+        <w:t>psql -U postgres -h localhost -p 5433 -d lsi_documentbase -f sql/queries/08_query_runs_and_results.sql</w:t>
+      </w:r>
+    </w:p>
+    <w:p>
+      <w:pPr/>
+      <w:r>
+        <w:t>The successful run confirms that the project imports real PDFs, stores them in PostgreSQL, loads them as the runtime corpus, builds FrecT, applies SVD/LSI, performs the required queries, and persists the generated artifacts and ranked results.</w:t>
       </w:r>
     </w:p>
     <w:p>
@@ -828,7 +956,13 @@
         <w:spacing w:after="80"/>
       </w:pPr>
       <w:r>
-        <w:t>Operational condition: PostgreSQL must be running, migrated, and seeded for persistence to complete at runtime. Without the DBMS, the CLI still demonstrates the algorithmic flow and reports that persistence could not be completed.</w:t>
+        <w:t>The final integrated version does not only demonstrate the algorithmic LSI pipeline. It also provides a functional PostgreSQL-backed execution path where real PDFs are imported, indexed, transformed into FrecT/LSI artifacts, and persisted with query history and ranked results.</w:t>
+      </w:r>
+    </w:p>
+    <w:p>
+      <w:pPr/>
+      <w:r>
+        <w:t>Operational condition: PostgreSQL must be running, migrated, and configured for persistence to complete at runtime. Without the DBMS, the CLI can still demonstrate part of the algorithmic flow, but the recommended final verification requires the full database-backed path.</w:t>
       </w:r>
     </w:p>
     <w:p>

</xml_diff>